<commit_message>
docs: refresh WORKING_INSTRUCTION for integrations, assignments, and VPS deploy
Document bidirectional project assignment, Integrations settings, and the full VPS deploy flow including composer dump-autoload; regenerate the Word copy from Markdown.

Co-authored-by: Cursor <cursoragent@cursor.com>
</commit_message>
<xml_diff>
--- a/WORKING_INSTRUCTION.docx
+++ b/WORKING_INSTRUCTION.docx
@@ -54,7 +54,16 @@
         <w:rPr>
           <w:b/>
         </w:rPr>
-        <w:t>Manajemen Proyek</w:t>
+        <w:t>Manajemen Proyek &amp; Penugasan Karyawan</w:t>
+      </w:r>
+      <w:r>
+        <w:t xml:space="preserve">, </w:t>
+      </w:r>
+      <w:r>
+        <w:rPr>
+          <w:b/>
+        </w:rPr>
+        <w:t>Integrasi (SMTP / auraAI / Jira)</w:t>
       </w:r>
       <w:r>
         <w:t xml:space="preserve">, </w:t>
@@ -292,7 +301,16 @@
               <w:t>Projects</w:t>
             </w:r>
             <w:r>
-              <w:t>), Tugas (</w:t>
+              <w:t xml:space="preserve">), </w:t>
+            </w:r>
+            <w:r>
+              <w:rPr>
+                <w:b/>
+              </w:rPr>
+              <w:t>Tugaskan Karyawan ke Proyek</w:t>
+            </w:r>
+            <w:r>
+              <w:t>, Tugas (</w:t>
             </w:r>
             <w:r>
               <w:rPr>
@@ -1198,63 +1216,175 @@
         <w:pStyle w:val="Heading2"/>
       </w:pPr>
       <w:r>
-        <w:t>D. Memantau Kontrak yang Akan Habis (Alert 30 Hari) &amp; Approval Cuti Berjenjang (SLA 24 Jam)</w:t>
+        <w:t>D. Menugaskan Proyek dari Profil Karyawan (`Assigned Projects`)</w:t>
       </w:r>
     </w:p>
     <w:p>
       <w:pPr>
-        <w:pStyle w:val="ListBullet"/>
-      </w:pPr>
+        <w:pStyle w:val="ListNumber"/>
+      </w:pPr>
+      <w:r>
+        <w:t xml:space="preserve">Buka </w:t>
+      </w:r>
       <w:r>
         <w:rPr>
           <w:b/>
         </w:rPr>
-        <w:t>Tab Filter Cepat Kontrak:</w:t>
-      </w:r>
-      <w:r>
-        <w:t xml:space="preserve"> Klik tab </w:t>
+        <w:t>Employees → Employees</w:t>
+      </w:r>
+      <w:r>
+        <w:t xml:space="preserve"> → pilih karyawan → pastikan </w:t>
       </w:r>
       <w:r>
         <w:rPr>
           <w:b/>
         </w:rPr>
-        <w:t>`Kontrak Segera Berakhir` (`Expiring Contracts`)</w:t>
-      </w:r>
-      <w:r>
-        <w:t xml:space="preserve"> di daftar </w:t>
-      </w:r>
-      <w:r>
-        <w:rPr>
-          <w:b/>
-        </w:rPr>
-        <w:t>Employees</w:t>
-      </w:r>
-      <w:r>
-        <w:t xml:space="preserve"> untuk melihat karyawan dengan sisa kontrak </w:t>
-      </w:r>
-      <w:r>
-        <w:rPr>
-          <w:rFonts w:ascii="Consolas" w:hAnsi="Consolas"/>
-        </w:rPr>
-        <w:t>≤ 30 hari</w:t>
-      </w:r>
-      <w:r>
-        <w:t>.</w:t>
+        <w:t>Pengguna Terkait (`Related User`)</w:t>
+      </w:r>
+      <w:r>
+        <w:t xml:space="preserve"> sudah diisi bila karyawan perlu login/akses proyek.</w:t>
       </w:r>
     </w:p>
     <w:p>
       <w:pPr>
-        <w:pStyle w:val="ListBullet"/>
-      </w:pPr>
+        <w:pStyle w:val="ListNumber"/>
+      </w:pPr>
+      <w:r>
+        <w:t xml:space="preserve">Buka tab </w:t>
+      </w:r>
       <w:r>
         <w:rPr>
           <w:b/>
         </w:rPr>
-        <w:t>Approval Cuti/Izin Berjenjang &amp; Eskalasi Otomatis 24 Jam (`Time Off`):</w:t>
+        <w:t>Proyek Ditugaskan (`Assigned Projects`)</w:t>
+      </w:r>
+      <w:r>
+        <w:t xml:space="preserve"> (</w:t>
+      </w:r>
+      <w:r>
+        <w:rPr>
+          <w:rFonts w:ascii="Consolas" w:hAnsi="Consolas"/>
+        </w:rPr>
+        <w:t>/admin/employees/employees/{id}/assigned-projects</w:t>
+      </w:r>
+      <w:r>
+        <w:t>).</w:t>
       </w:r>
     </w:p>
     <w:p>
       <w:pPr>
+        <w:pStyle w:val="ListNumber"/>
+      </w:pPr>
+      <w:r>
+        <w:t xml:space="preserve">Pilih satu atau beberapa </w:t>
+      </w:r>
+      <w:r>
+        <w:rPr>
+          <w:b/>
+        </w:rPr>
+        <w:t>Proyek</w:t>
+      </w:r>
+      <w:r>
+        <w:t xml:space="preserve">, lalu klik </w:t>
+      </w:r>
+      <w:r>
+        <w:rPr>
+          <w:b/>
+        </w:rPr>
+        <w:t>Simpan Penugasan</w:t>
+      </w:r>
+      <w:r>
+        <w:t>.</w:t>
+      </w:r>
+    </w:p>
+    <w:p>
+      <w:pPr>
+        <w:pStyle w:val="ListNumber"/>
+      </w:pPr>
+      <w:r>
+        <w:t xml:space="preserve">Penugasan ini tersinkron dengan layar </w:t>
+      </w:r>
+      <w:r>
+        <w:rPr>
+          <w:b/>
+        </w:rPr>
+        <w:t>Project → Tugaskan Karyawan</w:t>
+      </w:r>
+      <w:r>
+        <w:t xml:space="preserve"> (data &amp; followers yang sama). Lihat juga </w:t>
+      </w:r>
+      <w:r>
+        <w:rPr>
+          <w:b/>
+        </w:rPr>
+        <w:t>§7</w:t>
+      </w:r>
+      <w:r>
+        <w:t>.</w:t>
+      </w:r>
+    </w:p>
+    <w:p>
+      <w:pPr>
+        <w:pStyle w:val="Heading2"/>
+      </w:pPr>
+      <w:r>
+        <w:t>E. Memantau Kontrak yang Akan Habis (Alert 30 Hari) &amp; Approval Cuti Berjenjang (SLA 24 Jam)</w:t>
+      </w:r>
+    </w:p>
+    <w:p>
+      <w:pPr>
+        <w:pStyle w:val="ListBullet"/>
+      </w:pPr>
+      <w:r>
+        <w:rPr>
+          <w:b/>
+        </w:rPr>
+        <w:t>Tab Filter Cepat Kontrak:</w:t>
+      </w:r>
+      <w:r>
+        <w:t xml:space="preserve"> Klik tab </w:t>
+      </w:r>
+      <w:r>
+        <w:rPr>
+          <w:b/>
+        </w:rPr>
+        <w:t>`Kontrak Segera Berakhir` (`Expiring Contracts`)</w:t>
+      </w:r>
+      <w:r>
+        <w:t xml:space="preserve"> di daftar </w:t>
+      </w:r>
+      <w:r>
+        <w:rPr>
+          <w:b/>
+        </w:rPr>
+        <w:t>Employees</w:t>
+      </w:r>
+      <w:r>
+        <w:t xml:space="preserve"> untuk melihat karyawan dengan sisa kontrak </w:t>
+      </w:r>
+      <w:r>
+        <w:rPr>
+          <w:rFonts w:ascii="Consolas" w:hAnsi="Consolas"/>
+        </w:rPr>
+        <w:t>≤ 30 hari</w:t>
+      </w:r>
+      <w:r>
+        <w:t>.</w:t>
+      </w:r>
+    </w:p>
+    <w:p>
+      <w:pPr>
+        <w:pStyle w:val="ListBullet"/>
+      </w:pPr>
+      <w:r>
+        <w:rPr>
+          <w:b/>
+        </w:rPr>
+        <w:t>Approval Cuti/Izin Berjenjang &amp; Eskalasi Otomatis 24 Jam (`Time Off`):</w:t>
+      </w:r>
+    </w:p>
+    <w:p>
+      <w:pPr>
         <w:pStyle w:val="ListBullet"/>
         <w:ind w:left="360"/>
       </w:pPr>
@@ -3319,7 +3449,7 @@
         <w:rPr>
           <w:b/>
         </w:rPr>
-        <w:t>Penugasan Karyawan ke Proyek (Layar Khusus — Admin &amp; Operation Manager):</w:t>
+        <w:t>Penugasan Karyawan ke Proyek (dua arah — Admin &amp; Operation Manager):</w:t>
       </w:r>
     </w:p>
     <w:p>
@@ -3328,12 +3458,18 @@
         <w:ind w:left="360"/>
       </w:pPr>
       <w:r>
-        <w:t xml:space="preserve">Buka menu </w:t>
-      </w:r>
-      <w:r>
         <w:rPr>
           <w:b/>
         </w:rPr>
+        <w:t>Dari Proyek:</w:t>
+      </w:r>
+      <w:r>
+        <w:t xml:space="preserve"> menu </w:t>
+      </w:r>
+      <w:r>
+        <w:rPr>
+          <w:b/>
+        </w:rPr>
         <w:t>Project → Tugaskan Karyawan (`Assign Employees`)</w:t>
       </w:r>
       <w:r>
@@ -3346,7 +3482,34 @@
         <w:t>/admin/project/assign-employees</w:t>
       </w:r>
       <w:r>
-        <w:t>).</w:t>
+        <w:t xml:space="preserve">) → pilih </w:t>
+      </w:r>
+      <w:r>
+        <w:rPr>
+          <w:b/>
+        </w:rPr>
+        <w:t>Proyek</w:t>
+      </w:r>
+      <w:r>
+        <w:t xml:space="preserve">, lalu pilih satu atau beberapa </w:t>
+      </w:r>
+      <w:r>
+        <w:rPr>
+          <w:b/>
+        </w:rPr>
+        <w:t>Karyawan</w:t>
+      </w:r>
+      <w:r>
+        <w:t xml:space="preserve">, klik </w:t>
+      </w:r>
+      <w:r>
+        <w:rPr>
+          <w:b/>
+        </w:rPr>
+        <w:t>Simpan Penugasan</w:t>
+      </w:r>
+      <w:r>
+        <w:t>.</w:t>
       </w:r>
     </w:p>
     <w:p>
@@ -3355,25 +3518,31 @@
         <w:ind w:left="360"/>
       </w:pPr>
       <w:r>
-        <w:t xml:space="preserve">Pilih </w:t>
-      </w:r>
-      <w:r>
         <w:rPr>
           <w:b/>
         </w:rPr>
-        <w:t>Proyek</w:t>
-      </w:r>
-      <w:r>
-        <w:t xml:space="preserve">, lalu pilih satu atau beberapa </w:t>
+        <w:t>Dari Karyawan:</w:t>
+      </w:r>
+      <w:r>
+        <w:t xml:space="preserve"> buka </w:t>
       </w:r>
       <w:r>
         <w:rPr>
           <w:b/>
         </w:rPr>
-        <w:t>Karyawan</w:t>
-      </w:r>
-      <w:r>
-        <w:t xml:space="preserve">, kemudian klik </w:t>
+        <w:t>Employees → Employees</w:t>
+      </w:r>
+      <w:r>
+        <w:t xml:space="preserve"> → pilih karyawan → tab </w:t>
+      </w:r>
+      <w:r>
+        <w:rPr>
+          <w:b/>
+        </w:rPr>
+        <w:t>Proyek Ditugaskan (`Assigned Projects`)</w:t>
+      </w:r>
+      <w:r>
+        <w:t xml:space="preserve"> → pilih proyek → </w:t>
       </w:r>
       <w:r>
         <w:rPr>
@@ -3391,7 +3560,7 @@
         <w:ind w:left="360"/>
       </w:pPr>
       <w:r>
-        <w:t xml:space="preserve">Sistem menyimpan anggota proyek di data penugasan karyawan, dan otomatis menambahkan karyawan yang punya partner/user terkait sebagai </w:t>
+        <w:t xml:space="preserve">Kedua cara memakai data penugasan yang sama, dan otomatis menambahkan karyawan yang punya partner/user terkait sebagai </w:t>
       </w:r>
       <w:r>
         <w:rPr>
@@ -3424,15 +3593,6 @@
         <w:t>Pengguna Terkait (`Related User`)</w:t>
       </w:r>
       <w:r>
-        <w:t xml:space="preserve"> di </w:t>
-      </w:r>
-      <w:r>
-        <w:rPr>
-          <w:b/>
-        </w:rPr>
-        <w:t>Employees → Employees</w:t>
-      </w:r>
-      <w:r>
         <w:t>. Tanpa ini, penugasan tetap tersimpan, tetapi karyawan belum bisa login/mengakses proyek.</w:t>
       </w:r>
     </w:p>
@@ -3442,25 +3602,7 @@
         <w:ind w:left="360"/>
       </w:pPr>
       <w:r>
-        <w:t xml:space="preserve">Hak akses layar ini: </w:t>
-      </w:r>
-      <w:r>
-        <w:rPr>
-          <w:b/>
-        </w:rPr>
-        <w:t>Admin</w:t>
-      </w:r>
-      <w:r>
-        <w:t xml:space="preserve"> dan </w:t>
-      </w:r>
-      <w:r>
-        <w:rPr>
-          <w:b/>
-        </w:rPr>
-        <w:t>Operation Manager</w:t>
-      </w:r>
-      <w:r>
-        <w:t xml:space="preserve"> (</w:t>
+        <w:t xml:space="preserve">Layar Project Assign: permission </w:t>
       </w:r>
       <w:r>
         <w:rPr>
@@ -3469,16 +3611,7 @@
         <w:t>page_project_assign_project_employees</w:t>
       </w:r>
       <w:r>
-        <w:t xml:space="preserve">). Setelah deploy, jalankan </w:t>
-      </w:r>
-      <w:r>
-        <w:rPr>
-          <w:rFonts w:ascii="Consolas" w:hAnsi="Consolas"/>
-        </w:rPr>
-        <w:t>php artisan security:sync-rbac</w:t>
-      </w:r>
-      <w:r>
-        <w:t xml:space="preserve"> bila menu belum muncul.</w:t>
+        <w:t>. Tab di Employee mengikuti izin update Employee (plugin Projects harus terpasang).</w:t>
       </w:r>
     </w:p>
     <w:p>
@@ -3903,7 +4036,7 @@
         <w:pStyle w:val="Heading1"/>
       </w:pPr>
       <w:r>
-        <w:t>9. Penggunaan `auraAI Assistant` &amp; Pengaturan Tema Modern (`Branding`)</w:t>
+        <w:t>9. Integrasi SMTP, auraAI &amp; Jira (`Settings → Integrations`)</w:t>
       </w:r>
     </w:p>
     <w:p>
@@ -3911,57 +4044,99 @@
         <w:pStyle w:val="ListNumber"/>
       </w:pPr>
       <w:r>
+        <w:t xml:space="preserve">Buka </w:t>
+      </w:r>
+      <w:r>
         <w:rPr>
           <w:b/>
         </w:rPr>
-        <w:t>Floating Chatbot `✨ auraAI` &amp; Tombol `✨ Tanya AI` di Chatter:</w:t>
+        <w:t>Settings → Integrations</w:t>
+      </w:r>
+      <w:r>
+        <w:t xml:space="preserve"> (</w:t>
+      </w:r>
+      <w:r>
+        <w:rPr>
+          <w:rFonts w:ascii="Consolas" w:hAnsi="Consolas"/>
+        </w:rPr>
+        <w:t>/admin/integrations/manage-integrations</w:t>
+      </w:r>
+      <w:r>
+        <w:t xml:space="preserve">) — role </w:t>
+      </w:r>
+      <w:r>
+        <w:rPr>
+          <w:b/>
+        </w:rPr>
+        <w:t>Admin</w:t>
+      </w:r>
+      <w:r>
+        <w:t xml:space="preserve"> (permission </w:t>
+      </w:r>
+      <w:r>
+        <w:rPr>
+          <w:rFonts w:ascii="Consolas" w:hAnsi="Consolas"/>
+        </w:rPr>
+        <w:t>page_integrations_manage_integrations</w:t>
+      </w:r>
+      <w:r>
+        <w:t>).</w:t>
       </w:r>
     </w:p>
     <w:p>
       <w:pPr>
+        <w:pStyle w:val="ListNumber"/>
+      </w:pPr>
+      <w:r>
+        <w:t>Isi konfigurasi per konektor:</w:t>
+      </w:r>
+    </w:p>
+    <w:p>
+      <w:pPr>
         <w:pStyle w:val="ListBullet"/>
         <w:ind w:left="360"/>
       </w:pPr>
       <w:r>
-        <w:t xml:space="preserve">Klik tombol </w:t>
-      </w:r>
-      <w:r>
         <w:rPr>
           <w:b/>
         </w:rPr>
-        <w:t>`✨ auraAI`</w:t>
-      </w:r>
-      <w:r>
-        <w:t xml:space="preserve"> di pojok kanan bawah atau gunakan </w:t>
+        <w:t>SMTP:</w:t>
+      </w:r>
+      <w:r>
+        <w:t xml:space="preserve"> host, port, enkripsi, username/password, from address — lalu </w:t>
       </w:r>
       <w:r>
         <w:rPr>
           <w:b/>
         </w:rPr>
-        <w:t>`✨ Tanya AI`</w:t>
-      </w:r>
-      <w:r>
-        <w:t xml:space="preserve"> / mention </w:t>
-      </w:r>
-      <w:r>
-        <w:rPr>
-          <w:b/>
-        </w:rPr>
-        <w:t>`@ai`</w:t>
-      </w:r>
-      <w:r>
-        <w:t xml:space="preserve"> di panel Chatter dokumen apa pun. Data yang disajikan otomatis mengikuti hak akses &amp; scope user yang sedang login.</w:t>
+        <w:t>Test Connection</w:t>
+      </w:r>
+      <w:r>
+        <w:t>.</w:t>
       </w:r>
     </w:p>
     <w:p>
       <w:pPr>
-        <w:pStyle w:val="ListNumber"/>
+        <w:pStyle w:val="ListBullet"/>
+        <w:ind w:left="360"/>
       </w:pPr>
       <w:r>
         <w:rPr>
           <w:b/>
         </w:rPr>
-        <w:t>Preset Tema Warna 1-Klik (`Settings → Manage Branding`):</w:t>
+        <w:t>AI (auraAI):</w:t>
+      </w:r>
+      <w:r>
+        <w:t xml:space="preserve"> provider/base URL, API key, model — lalu </w:t>
+      </w:r>
+      <w:r>
+        <w:rPr>
+          <w:b/>
+        </w:rPr>
+        <w:t>Test Connection</w:t>
+      </w:r>
+      <w:r>
+        <w:t>.</w:t>
       </w:r>
     </w:p>
     <w:p>
@@ -3970,87 +4145,229 @@
         <w:ind w:left="360"/>
       </w:pPr>
       <w:r>
-        <w:t xml:space="preserve">Buka </w:t>
-      </w:r>
-      <w:r>
         <w:rPr>
           <w:b/>
         </w:rPr>
-        <w:t>Settings → General → Manage Branding</w:t>
-      </w:r>
-      <w:r>
-        <w:t xml:space="preserve"> untuk memilih tema warna instan (</w:t>
-      </w:r>
-      <w:r>
-        <w:rPr>
-          <w:rFonts w:ascii="Consolas" w:hAnsi="Consolas"/>
-        </w:rPr>
-        <w:t>Aura Indigo</w:t>
-      </w:r>
-      <w:r>
-        <w:t xml:space="preserve">, </w:t>
-      </w:r>
-      <w:r>
-        <w:rPr>
-          <w:rFonts w:ascii="Consolas" w:hAnsi="Consolas"/>
-        </w:rPr>
-        <w:t>Emerald Fresh</w:t>
-      </w:r>
-      <w:r>
-        <w:t xml:space="preserve">, </w:t>
-      </w:r>
-      <w:r>
-        <w:rPr>
-          <w:rFonts w:ascii="Consolas" w:hAnsi="Consolas"/>
-        </w:rPr>
-        <w:t>Ocean Blue</w:t>
-      </w:r>
-      <w:r>
-        <w:t xml:space="preserve">, </w:t>
-      </w:r>
-      <w:r>
-        <w:rPr>
-          <w:rFonts w:ascii="Consolas" w:hAnsi="Consolas"/>
-        </w:rPr>
-        <w:t>Royal Violet</w:t>
-      </w:r>
-      <w:r>
-        <w:t xml:space="preserve">, </w:t>
-      </w:r>
-      <w:r>
-        <w:rPr>
-          <w:rFonts w:ascii="Consolas" w:hAnsi="Consolas"/>
-        </w:rPr>
-        <w:t>Sunset Amber</w:t>
-      </w:r>
-      <w:r>
-        <w:t xml:space="preserve">, </w:t>
-      </w:r>
-      <w:r>
-        <w:rPr>
-          <w:rFonts w:ascii="Consolas" w:hAnsi="Consolas"/>
-        </w:rPr>
-        <w:t>Rose Modern</w:t>
-      </w:r>
-      <w:r>
-        <w:t xml:space="preserve">, atau </w:t>
-      </w:r>
-      <w:r>
-        <w:rPr>
-          <w:rFonts w:ascii="Consolas" w:hAnsi="Consolas"/>
-        </w:rPr>
-        <w:t>Slate Minimal</w:t>
-      </w:r>
-      <w:r>
-        <w:t>).</w:t>
+        <w:t>Jira:</w:t>
+      </w:r>
+      <w:r>
+        <w:t xml:space="preserve"> base URL, email/username, API token — lalu </w:t>
+      </w:r>
+      <w:r>
+        <w:rPr>
+          <w:b/>
+        </w:rPr>
+        <w:t>Test Connection</w:t>
+      </w:r>
+      <w:r>
+        <w:t>.</w:t>
       </w:r>
     </w:p>
     <w:p>
       <w:pPr>
+        <w:pStyle w:val="ListNumber"/>
+      </w:pPr>
+      <w:r>
+        <w:t>Rahasia (password/token) disimpan terenkripsi di settings; biarkan kosong saat edit jika tidak ingin mengubah nilai yang sudah tersimpan.</w:t>
+      </w:r>
+    </w:p>
+    <w:p>
+      <w:pPr>
+        <w:pStyle w:val="ListNumber"/>
+      </w:pPr>
+      <w:r>
+        <w:t xml:space="preserve">Setelah plugin baru dipasang di server, jalankan </w:t>
+      </w:r>
+      <w:r>
+        <w:rPr>
+          <w:rFonts w:ascii="Consolas" w:hAnsi="Consolas"/>
+        </w:rPr>
+        <w:t>php artisan integrations:install</w:t>
+      </w:r>
+      <w:r>
+        <w:t xml:space="preserve"> (lihat </w:t>
+      </w:r>
+      <w:r>
+        <w:rPr>
+          <w:b/>
+        </w:rPr>
+        <w:t>§12</w:t>
+      </w:r>
+      <w:r>
+        <w:t>).</w:t>
+      </w:r>
+    </w:p>
+    <w:p>
+      <w:pPr>
         <w:pStyle w:val="Heading1"/>
       </w:pPr>
       <w:r>
-        <w:t>10. Ringkasan Menu yang Mendukung Export / Bulk Import Excel (`.xlsx`)</w:t>
+        <w:t>10. Penggunaan `auraAI Assistant` &amp; Pengaturan Tema Modern (`Branding`)</w:t>
+      </w:r>
+    </w:p>
+    <w:p>
+      <w:pPr>
+        <w:pStyle w:val="ListNumber"/>
+      </w:pPr>
+      <w:r>
+        <w:rPr>
+          <w:b/>
+        </w:rPr>
+        <w:t>Floating Chatbot `✨ auraAI` &amp; Tombol `✨ Tanya AI` di Chatter:</w:t>
+      </w:r>
+    </w:p>
+    <w:p>
+      <w:pPr>
+        <w:pStyle w:val="ListBullet"/>
+        <w:ind w:left="360"/>
+      </w:pPr>
+      <w:r>
+        <w:t xml:space="preserve">Klik tombol </w:t>
+      </w:r>
+      <w:r>
+        <w:rPr>
+          <w:b/>
+        </w:rPr>
+        <w:t>`✨ auraAI`</w:t>
+      </w:r>
+      <w:r>
+        <w:t xml:space="preserve"> di pojok kanan bawah atau gunakan </w:t>
+      </w:r>
+      <w:r>
+        <w:rPr>
+          <w:b/>
+        </w:rPr>
+        <w:t>`✨ Tanya AI`</w:t>
+      </w:r>
+      <w:r>
+        <w:t xml:space="preserve"> / mention </w:t>
+      </w:r>
+      <w:r>
+        <w:rPr>
+          <w:b/>
+        </w:rPr>
+        <w:t>`@ai`</w:t>
+      </w:r>
+      <w:r>
+        <w:t xml:space="preserve"> di panel Chatter dokumen apa pun. Data yang disajikan otomatis mengikuti hak akses &amp; scope user yang sedang login.</w:t>
+      </w:r>
+    </w:p>
+    <w:p>
+      <w:pPr>
+        <w:pStyle w:val="ListBullet"/>
+        <w:ind w:left="360"/>
+      </w:pPr>
+      <w:r>
+        <w:t xml:space="preserve">Konfigurasi koneksi AI dapat diatur di </w:t>
+      </w:r>
+      <w:r>
+        <w:rPr>
+          <w:b/>
+        </w:rPr>
+        <w:t>Settings → Integrations</w:t>
+      </w:r>
+      <w:r>
+        <w:t xml:space="preserve"> (§9).</w:t>
+      </w:r>
+    </w:p>
+    <w:p>
+      <w:pPr>
+        <w:pStyle w:val="ListNumber"/>
+      </w:pPr>
+      <w:r>
+        <w:rPr>
+          <w:b/>
+        </w:rPr>
+        <w:t>Preset Tema Warna 1-Klik (`Settings → Manage Branding`):</w:t>
+      </w:r>
+    </w:p>
+    <w:p>
+      <w:pPr>
+        <w:pStyle w:val="ListBullet"/>
+        <w:ind w:left="360"/>
+      </w:pPr>
+      <w:r>
+        <w:t xml:space="preserve">Buka </w:t>
+      </w:r>
+      <w:r>
+        <w:rPr>
+          <w:b/>
+        </w:rPr>
+        <w:t>Settings → General → Manage Branding</w:t>
+      </w:r>
+      <w:r>
+        <w:t xml:space="preserve"> untuk memilih tema warna instan (</w:t>
+      </w:r>
+      <w:r>
+        <w:rPr>
+          <w:rFonts w:ascii="Consolas" w:hAnsi="Consolas"/>
+        </w:rPr>
+        <w:t>Aura Indigo</w:t>
+      </w:r>
+      <w:r>
+        <w:t xml:space="preserve">, </w:t>
+      </w:r>
+      <w:r>
+        <w:rPr>
+          <w:rFonts w:ascii="Consolas" w:hAnsi="Consolas"/>
+        </w:rPr>
+        <w:t>Emerald Fresh</w:t>
+      </w:r>
+      <w:r>
+        <w:t xml:space="preserve">, </w:t>
+      </w:r>
+      <w:r>
+        <w:rPr>
+          <w:rFonts w:ascii="Consolas" w:hAnsi="Consolas"/>
+        </w:rPr>
+        <w:t>Ocean Blue</w:t>
+      </w:r>
+      <w:r>
+        <w:t xml:space="preserve">, </w:t>
+      </w:r>
+      <w:r>
+        <w:rPr>
+          <w:rFonts w:ascii="Consolas" w:hAnsi="Consolas"/>
+        </w:rPr>
+        <w:t>Royal Violet</w:t>
+      </w:r>
+      <w:r>
+        <w:t xml:space="preserve">, </w:t>
+      </w:r>
+      <w:r>
+        <w:rPr>
+          <w:rFonts w:ascii="Consolas" w:hAnsi="Consolas"/>
+        </w:rPr>
+        <w:t>Sunset Amber</w:t>
+      </w:r>
+      <w:r>
+        <w:t xml:space="preserve">, </w:t>
+      </w:r>
+      <w:r>
+        <w:rPr>
+          <w:rFonts w:ascii="Consolas" w:hAnsi="Consolas"/>
+        </w:rPr>
+        <w:t>Rose Modern</w:t>
+      </w:r>
+      <w:r>
+        <w:t xml:space="preserve">, atau </w:t>
+      </w:r>
+      <w:r>
+        <w:rPr>
+          <w:rFonts w:ascii="Consolas" w:hAnsi="Consolas"/>
+        </w:rPr>
+        <w:t>Slate Minimal</w:t>
+      </w:r>
+      <w:r>
+        <w:t>).</w:t>
+      </w:r>
+    </w:p>
+    <w:p>
+      <w:pPr>
+        <w:pStyle w:val="Heading1"/>
+      </w:pPr>
+      <w:r>
+        <w:t>11. Ringkasan Menu yang Mendukung Export / Bulk Import Excel (`.xlsx`)</w:t>
       </w:r>
     </w:p>
     <w:tbl>
@@ -4420,7 +4737,7 @@
         <w:pStyle w:val="Heading1"/>
       </w:pPr>
       <w:r>
-        <w:t>11. Panduan Update / Deploy di Server VPS</w:t>
+        <w:t>12. Panduan Update / Deploy di Server VPS</w:t>
       </w:r>
     </w:p>
     <w:p>
@@ -4452,7 +4769,15 @@
         <w:t>ubuntu@VM-18-102-ubuntu</w:t>
       </w:r>
       <w:r>
-        <w:t>):</w:t>
+        <w:t>).</w:t>
+      </w:r>
+    </w:p>
+    <w:p>
+      <w:r>
+        <w:rPr>
+          <w:b/>
+        </w:rPr>
+        <w:t>Langkah standar (setelah ada plugin/composer baru, gunakan blok lengkap di bawah):</w:t>
       </w:r>
     </w:p>
     <w:p>
@@ -4469,19 +4794,190 @@
         <w:br/>
         <w:t>git reset --hard origin/main &amp;&amp; \</w:t>
         <w:br/>
-        <w:t>sudo chown -R www-data:www-data storage bootstrap/cache &amp;&amp; \</w:t>
+        <w:t>composer dump-autoload -o &amp;&amp; \</w:t>
+        <w:br/>
+        <w:t>sudo -u www-data php artisan migrate --force --no-interaction &amp;&amp; \</w:t>
+        <w:br/>
+        <w:t>sudo -u www-data php artisan integrations:install --no-interaction &amp;&amp; \</w:t>
+        <w:br/>
+        <w:t>sudo -u www-data php artisan security:sync-rbac &amp;&amp; \</w:t>
+        <w:br/>
+        <w:t>sudo chown -R www-data:www-data storage bootstrap/cache public &amp;&amp; \</w:t>
         <w:br/>
         <w:t>sudo chmod -R ug+rwx storage bootstrap/cache &amp;&amp; \</w:t>
         <w:br/>
-        <w:t>sudo -u www-data php artisan migrate --force --no-interaction &amp;&amp; \</w:t>
-        <w:br/>
-        <w:t>sudo -u www-data php artisan security:sync-rbac &amp;&amp; \</w:t>
-        <w:br/>
-        <w:t>sudo -u www-data php artisan employees:notify-expiring-contracts &amp;&amp; \</w:t>
-        <w:br/>
-        <w:t>sudo -u www-data php artisan projects:notify-expiring-projects &amp;&amp; \</w:t>
-        <w:br/>
         <w:t>sudo -u www-data php artisan optimize:clear</w:t>
+      </w:r>
+    </w:p>
+    <w:p>
+      <w:r>
+        <w:rPr>
+          <w:b/>
+        </w:rPr>
+        <w:t>Catatan deploy:</w:t>
+      </w:r>
+    </w:p>
+    <w:p>
+      <w:pPr>
+        <w:pStyle w:val="ListNumber"/>
+      </w:pPr>
+      <w:r>
+        <w:rPr>
+          <w:rFonts w:ascii="Consolas" w:hAnsi="Consolas"/>
+        </w:rPr>
+        <w:t>sudo chown ... ubuntu:www-data</w:t>
+      </w:r>
+      <w:r>
+        <w:t xml:space="preserve"> diperlukan sebelum </w:t>
+      </w:r>
+      <w:r>
+        <w:rPr>
+          <w:rFonts w:ascii="Consolas" w:hAnsi="Consolas"/>
+        </w:rPr>
+        <w:t>composer dump-autoload</w:t>
+      </w:r>
+      <w:r>
+        <w:t xml:space="preserve"> agar </w:t>
+      </w:r>
+      <w:r>
+        <w:rPr>
+          <w:rFonts w:ascii="Consolas" w:hAnsi="Consolas"/>
+        </w:rPr>
+        <w:t>filament:upgrade</w:t>
+      </w:r>
+      <w:r>
+        <w:t xml:space="preserve"> (post-autoload-dump) bisa menulis ke </w:t>
+      </w:r>
+      <w:r>
+        <w:rPr>
+          <w:rFonts w:ascii="Consolas" w:hAnsi="Consolas"/>
+        </w:rPr>
+        <w:t>public/js</w:t>
+      </w:r>
+      <w:r>
+        <w:t xml:space="preserve"> &amp; </w:t>
+      </w:r>
+      <w:r>
+        <w:rPr>
+          <w:rFonts w:ascii="Consolas" w:hAnsi="Consolas"/>
+        </w:rPr>
+        <w:t>public/css</w:t>
+      </w:r>
+      <w:r>
+        <w:t>.</w:t>
+      </w:r>
+    </w:p>
+    <w:p>
+      <w:pPr>
+        <w:pStyle w:val="ListNumber"/>
+      </w:pPr>
+      <w:r>
+        <w:rPr>
+          <w:rFonts w:ascii="Consolas" w:hAnsi="Consolas"/>
+        </w:rPr>
+        <w:t>composer dump-autoload -o</w:t>
+      </w:r>
+      <w:r>
+        <w:t xml:space="preserve"> wajib jika ada </w:t>
+      </w:r>
+      <w:r>
+        <w:rPr>
+          <w:b/>
+        </w:rPr>
+        <w:t>plugin baru</w:t>
+      </w:r>
+      <w:r>
+        <w:t xml:space="preserve"> (mis. </w:t>
+      </w:r>
+      <w:r>
+        <w:rPr>
+          <w:rFonts w:ascii="Consolas" w:hAnsi="Consolas"/>
+        </w:rPr>
+        <w:t>integrations</w:t>
+      </w:r>
+      <w:r>
+        <w:t>) agar namespace Artisan &amp; autoload PSR-4 terdaftar.</w:t>
+      </w:r>
+    </w:p>
+    <w:p>
+      <w:pPr>
+        <w:pStyle w:val="ListNumber"/>
+      </w:pPr>
+      <w:r>
+        <w:rPr>
+          <w:rFonts w:ascii="Consolas" w:hAnsi="Consolas"/>
+        </w:rPr>
+        <w:t>integrations:install</w:t>
+      </w:r>
+      <w:r>
+        <w:t xml:space="preserve"> aman dijalankan ulang (idempotent) bila plugin sudah terpasang.</w:t>
+      </w:r>
+    </w:p>
+    <w:p>
+      <w:pPr>
+        <w:pStyle w:val="ListNumber"/>
+      </w:pPr>
+      <w:r>
+        <w:rPr>
+          <w:rFonts w:ascii="Consolas" w:hAnsi="Consolas"/>
+        </w:rPr>
+        <w:t>security:sync-rbac</w:t>
+      </w:r>
+      <w:r>
+        <w:t xml:space="preserve"> menyinkronkan permission baru (termasuk </w:t>
+      </w:r>
+      <w:r>
+        <w:rPr>
+          <w:b/>
+        </w:rPr>
+        <w:t>Tugaskan Karyawan</w:t>
+      </w:r>
+      <w:r>
+        <w:t xml:space="preserve"> &amp; </w:t>
+      </w:r>
+      <w:r>
+        <w:rPr>
+          <w:b/>
+        </w:rPr>
+        <w:t>Integrations</w:t>
+      </w:r>
+      <w:r>
+        <w:t>).</w:t>
+      </w:r>
+    </w:p>
+    <w:p>
+      <w:pPr>
+        <w:pStyle w:val="ListNumber"/>
+      </w:pPr>
+      <w:r>
+        <w:t xml:space="preserve">Setelah deploy, uji: login Admin → </w:t>
+      </w:r>
+      <w:r>
+        <w:rPr>
+          <w:b/>
+        </w:rPr>
+        <w:t>Project → Tugaskan Karyawan</w:t>
+      </w:r>
+      <w:r>
+        <w:t xml:space="preserve">, </w:t>
+      </w:r>
+      <w:r>
+        <w:rPr>
+          <w:b/>
+        </w:rPr>
+        <w:t>Employees → tab Proyek Ditugaskan</w:t>
+      </w:r>
+      <w:r>
+        <w:t xml:space="preserve">, </w:t>
+      </w:r>
+      <w:r>
+        <w:rPr>
+          <w:b/>
+        </w:rPr>
+        <w:t>Settings → Integrations</w:t>
+      </w:r>
+      <w:r>
+        <w:t>.</w:t>
       </w:r>
     </w:p>
     <w:sectPr>

</xml_diff>

<commit_message>
feat(accounting): split role Accounting Manager, Kontrol Anggaran Proyek, project_id invoice/bill
- Role Accounting (staff) kehilangan permission hapus finansial; role baru
  Accounting Manager memegang hak hapus + scope anggaran se-perusahaan
- Halaman Project > Kontrol Anggaran Proyek: kontrak vs terinvoice vs
  serapan anggaran operasional per proyek, status otomatis + ekspor Excel
- Kolom project_id pada accounts_account_moves + field Proyek di form
  invoice/bill sebagai dasar realisasi per proyek
- Docs: WI (8 role, panduan kontrol anggaran), matriks RBAC v1.5, PRD
  (SEC-08, PRJ-14, PRJ-15), docx diregenerasi

Co-authored-by: Cursor <cursoragent@cursor.com>
</commit_message>
<xml_diff>
--- a/WORKING_INSTRUCTION.docx
+++ b/WORKING_INSTRUCTION.docx
@@ -149,7 +149,7 @@
         <w:pStyle w:val="Heading2"/>
       </w:pPr>
       <w:r>
-        <w:t>A. 7 Role Standar Sistem (`php artisan security:sync-rbac`)</w:t>
+        <w:t>A. 8 Role Standar Sistem (`php artisan security:sync-rbac`)</w:t>
       </w:r>
     </w:p>
     <w:p>
@@ -531,7 +531,7 @@
               <w:rPr>
                 <w:b/>
               </w:rPr>
-              <w:t>Accounting</w:t>
+              <w:t>Accounting Manager</w:t>
             </w:r>
           </w:p>
         </w:tc>
@@ -542,7 +542,25 @@
           <w:p>
             <w:r/>
             <w:r>
-              <w:t xml:space="preserve">Invoice pelanggan, bill vendor, payment, partners/products terkait, serta </w:t>
+              <w:t xml:space="preserve">Seluruh hak Accounting </w:t>
+            </w:r>
+            <w:r>
+              <w:rPr>
+                <w:b/>
+              </w:rPr>
+              <w:t>termasuk menghapus</w:t>
+            </w:r>
+            <w:r>
+              <w:t xml:space="preserve"> invoice pelanggan, bill vendor, payment &amp; jurnal akuntansi (delete/restore/force-delete), serta </w:t>
+            </w:r>
+            <w:r>
+              <w:rPr>
+                <w:b/>
+              </w:rPr>
+              <w:t>Kontrol Anggaran Proyek se-perusahaan</w:t>
+            </w:r>
+            <w:r>
+              <w:t xml:space="preserve"> (tanpa scope tim) dan </w:t>
             </w:r>
             <w:r>
               <w:rPr>
@@ -551,7 +569,82 @@
               <w:t>Dashboard → Hari Saya</w:t>
             </w:r>
             <w:r>
-              <w:t xml:space="preserve"> dengan kontrol anggaran tim (invoice terbuka, overdue AR/AP, payment pending, budget proyek tim).</w:t>
+              <w:t xml:space="preserve"> bundle accounting penuh. Role ini untuk manajer akunting — berikan lewat </w:t>
+            </w:r>
+            <w:r>
+              <w:rPr>
+                <w:b/>
+              </w:rPr>
+              <w:t>Settings → Users</w:t>
+            </w:r>
+            <w:r>
+              <w:t xml:space="preserve"> setelah deploy; user Accounting lama </w:t>
+            </w:r>
+            <w:r>
+              <w:rPr>
+                <w:b/>
+              </w:rPr>
+              <w:t>tidak</w:t>
+            </w:r>
+            <w:r>
+              <w:t xml:space="preserve"> otomatis naik ke role ini.</w:t>
+            </w:r>
+          </w:p>
+        </w:tc>
+      </w:tr>
+      <w:tr>
+        <w:tc>
+          <w:tcPr>
+            <w:tcW w:type="dxa" w:w="4320"/>
+          </w:tcPr>
+          <w:p>
+            <w:r/>
+            <w:r>
+              <w:rPr>
+                <w:b/>
+              </w:rPr>
+              <w:t>Accounting</w:t>
+            </w:r>
+            <w:r>
+              <w:t xml:space="preserve"> *(staff)*</w:t>
+            </w:r>
+          </w:p>
+        </w:tc>
+        <w:tc>
+          <w:tcPr>
+            <w:tcW w:type="dxa" w:w="4320"/>
+          </w:tcPr>
+          <w:p>
+            <w:r/>
+            <w:r>
+              <w:t xml:space="preserve">Invoice pelanggan, bill vendor, payment, partners/products terkait — </w:t>
+            </w:r>
+            <w:r>
+              <w:rPr>
+                <w:b/>
+              </w:rPr>
+              <w:t>buat &amp; ubah saja, tidak bisa menghapus</w:t>
+            </w:r>
+            <w:r>
+              <w:t xml:space="preserve"> dokumen keuangan (hapus/restore/force-delete khusus Accounting Manager). </w:t>
+            </w:r>
+            <w:r>
+              <w:rPr>
+                <w:b/>
+              </w:rPr>
+              <w:t>Dashboard → Hari Saya</w:t>
+            </w:r>
+            <w:r>
+              <w:t xml:space="preserve"> dengan kontrol anggaran tim (invoice terbuka, overdue AR/AP, payment pending, budget proyek tim) dan halaman </w:t>
+            </w:r>
+            <w:r>
+              <w:rPr>
+                <w:b/>
+              </w:rPr>
+              <w:t>Project → Kontrol Anggaran Proyek</w:t>
+            </w:r>
+            <w:r>
+              <w:t xml:space="preserve"> terbatas pada proyek timnya.</w:t>
             </w:r>
           </w:p>
         </w:tc>
@@ -2638,7 +2731,7 @@
         <w:t>Penghapusan role berpelindung:</w:t>
       </w:r>
       <w:r>
-        <w:t xml:space="preserve"> role baseline (Admin/HRD/Operation Manager/Accounting/Kasir/Staff guard </w:t>
+        <w:t xml:space="preserve"> role baseline (Admin/HRD/Operation Manager/Accounting/Accounting Manager/Kasir/Staff/Team Leader guard </w:t>
       </w:r>
       <w:r>
         <w:rPr>
@@ -2720,7 +2813,7 @@
         <w:t>Aturan main penting:</w:t>
       </w:r>
       <w:r>
-        <w:t xml:space="preserve"> baseline 7 role standar didefinisikan di kode (</w:t>
+        <w:t xml:space="preserve"> baseline 8 role standar didefinisikan di kode (</w:t>
       </w:r>
       <w:r>
         <w:rPr>
@@ -7994,6 +8087,269 @@
       </w:r>
       <w:r>
         <w:t>.</w:t>
+      </w:r>
+    </w:p>
+    <w:p>
+      <w:pPr>
+        <w:pStyle w:val="ListNumber"/>
+      </w:pPr>
+      <w:r>
+        <w:rPr>
+          <w:b/>
+        </w:rPr>
+        <w:t>Kontrol Anggaran Proyek (tim Accounting — Manajer, Staff &amp; Admin):</w:t>
+      </w:r>
+    </w:p>
+    <w:p>
+      <w:pPr>
+        <w:pStyle w:val="ListBullet"/>
+        <w:ind w:left="360"/>
+      </w:pPr>
+      <w:r>
+        <w:t xml:space="preserve">Buka </w:t>
+      </w:r>
+      <w:r>
+        <w:rPr>
+          <w:b/>
+        </w:rPr>
+        <w:t>Project → Kontrol Anggaran Proyek</w:t>
+      </w:r>
+      <w:r>
+        <w:t xml:space="preserve"> (</w:t>
+      </w:r>
+      <w:r>
+        <w:rPr>
+          <w:rFonts w:ascii="Consolas" w:hAnsi="Consolas"/>
+        </w:rPr>
+        <w:t>/admin/project/budget-control</w:t>
+      </w:r>
+      <w:r>
+        <w:t xml:space="preserve">; permission </w:t>
+      </w:r>
+      <w:r>
+        <w:rPr>
+          <w:rFonts w:ascii="Consolas" w:hAnsi="Consolas"/>
+        </w:rPr>
+        <w:t>page_project_project_budget_control</w:t>
+      </w:r>
+      <w:r>
+        <w:t xml:space="preserve">): per proyek tampil </w:t>
+      </w:r>
+      <w:r>
+        <w:rPr>
+          <w:b/>
+        </w:rPr>
+        <w:t>Nilai Kontrak</w:t>
+      </w:r>
+      <w:r>
+        <w:t xml:space="preserve">, </w:t>
+      </w:r>
+      <w:r>
+        <w:rPr>
+          <w:b/>
+        </w:rPr>
+        <w:t>Terinvoice</w:t>
+      </w:r>
+      <w:r>
+        <w:t xml:space="preserve"> &amp; </w:t>
+      </w:r>
+      <w:r>
+        <w:rPr>
+          <w:b/>
+        </w:rPr>
+        <w:t>Belum terbayar</w:t>
+      </w:r>
+      <w:r>
+        <w:t xml:space="preserve"> (invoice pelanggan *posted*), </w:t>
+      </w:r>
+      <w:r>
+        <w:rPr>
+          <w:b/>
+        </w:rPr>
+        <w:t>Anggaran Operasional</w:t>
+      </w:r>
+      <w:r>
+        <w:t xml:space="preserve"> (field proyek </w:t>
+      </w:r>
+      <w:r>
+        <w:rPr>
+          <w:rFonts w:ascii="Consolas" w:hAnsi="Consolas"/>
+        </w:rPr>
+        <w:t>operational_cost</w:t>
+      </w:r>
+      <w:r>
+        <w:t xml:space="preserve">), </w:t>
+      </w:r>
+      <w:r>
+        <w:rPr>
+          <w:b/>
+        </w:rPr>
+        <w:t>Biaya Vendor (realisasi)</w:t>
+      </w:r>
+      <w:r>
+        <w:t xml:space="preserve"> (bill vendor *posted*), </w:t>
+      </w:r>
+      <w:r>
+        <w:rPr>
+          <w:b/>
+        </w:rPr>
+        <w:t>Serapan</w:t>
+      </w:r>
+      <w:r>
+        <w:t xml:space="preserve"> = biaya vendor ÷ anggaran, dan </w:t>
+      </w:r>
+      <w:r>
+        <w:rPr>
+          <w:b/>
+        </w:rPr>
+        <w:t>Jam Timesheet</w:t>
+      </w:r>
+      <w:r>
+        <w:t xml:space="preserve">. Status otomatis: </w:t>
+      </w:r>
+      <w:r>
+        <w:rPr>
+          <w:b/>
+        </w:rPr>
+        <w:t>Aman</w:t>
+      </w:r>
+      <w:r>
+        <w:t xml:space="preserve"> (&lt; 80%), </w:t>
+      </w:r>
+      <w:r>
+        <w:rPr>
+          <w:b/>
+        </w:rPr>
+        <w:t>Waspada ≥ 80%</w:t>
+      </w:r>
+      <w:r>
+        <w:t xml:space="preserve">, </w:t>
+      </w:r>
+      <w:r>
+        <w:rPr>
+          <w:b/>
+        </w:rPr>
+        <w:t>Over budget</w:t>
+      </w:r>
+      <w:r>
+        <w:t xml:space="preserve"> (≥ 100%, atau ada biaya tetapi anggaran belum diisi), </w:t>
+      </w:r>
+      <w:r>
+        <w:rPr>
+          <w:b/>
+        </w:rPr>
+        <w:t>Belum ada anggaran</w:t>
+      </w:r>
+      <w:r>
+        <w:t xml:space="preserve">. Tersedia pencarian, filter status, kartu ringkasan total, dan tombol </w:t>
+      </w:r>
+      <w:r>
+        <w:rPr>
+          <w:b/>
+        </w:rPr>
+        <w:t>Ekspor Excel</w:t>
+      </w:r>
+      <w:r>
+        <w:t xml:space="preserve"> (</w:t>
+      </w:r>
+      <w:r>
+        <w:rPr>
+          <w:rFonts w:ascii="Consolas" w:hAnsi="Consolas"/>
+        </w:rPr>
+        <w:t>project-budget-control.xlsx</w:t>
+      </w:r>
+      <w:r>
+        <w:t>).</w:t>
+      </w:r>
+    </w:p>
+    <w:p>
+      <w:pPr>
+        <w:pStyle w:val="ListBullet"/>
+        <w:ind w:left="360"/>
+      </w:pPr>
+      <w:r>
+        <w:rPr>
+          <w:b/>
+        </w:rPr>
+        <w:t>Prasyarat data:</w:t>
+      </w:r>
+      <w:r>
+        <w:t xml:space="preserve"> invoice pelanggan &amp; bill vendor harus </w:t>
+      </w:r>
+      <w:r>
+        <w:rPr>
+          <w:b/>
+        </w:rPr>
+        <w:t>dikaitkan ke proyek</w:t>
+      </w:r>
+      <w:r>
+        <w:t xml:space="preserve"> lewat field </w:t>
+      </w:r>
+      <w:r>
+        <w:rPr>
+          <w:b/>
+        </w:rPr>
+        <w:t>Proyek</w:t>
+      </w:r>
+      <w:r>
+        <w:t xml:space="preserve"> pada form invoice/bill (muncul setelah kolom Partner; pilihan invoice mengikuti customer proyek). Dokumen lama yang belum dikaitkan tidak ikut terhitung — kaitkan lewat Edit dokumen (dokumen *posted/cancel* tidak bisa diubah; kaitkan dokumen sejak dibuat ke depan).</w:t>
+      </w:r>
+    </w:p>
+    <w:p>
+      <w:pPr>
+        <w:pStyle w:val="ListBullet"/>
+        <w:ind w:left="360"/>
+      </w:pPr>
+      <w:r>
+        <w:rPr>
+          <w:b/>
+        </w:rPr>
+        <w:t>Scope:</w:t>
+      </w:r>
+      <w:r>
+        <w:t xml:space="preserve"> Admin &amp; </w:t>
+      </w:r>
+      <w:r>
+        <w:rPr>
+          <w:b/>
+        </w:rPr>
+        <w:t>Accounting Manager</w:t>
+      </w:r>
+      <w:r>
+        <w:t xml:space="preserve"> melihat seluruh perusahaan; </w:t>
+      </w:r>
+      <w:r>
+        <w:rPr>
+          <w:b/>
+        </w:rPr>
+        <w:t>Accounting (staff)</w:t>
+      </w:r>
+      <w:r>
+        <w:t xml:space="preserve"> hanya proyek timnya (scope yang sama dengan Hari Saya); saat staff belum tergabung tim mana pun, halaman mengikuti fallback Hari Saya (seluruh perusahaan).</w:t>
+      </w:r>
+    </w:p>
+    <w:p>
+      <w:pPr>
+        <w:pStyle w:val="ListBullet"/>
+        <w:ind w:left="360"/>
+      </w:pPr>
+      <w:r>
+        <w:rPr>
+          <w:b/>
+        </w:rPr>
+        <w:t>Pembagian tugas yang disarankan:</w:t>
+      </w:r>
+      <w:r>
+        <w:t xml:space="preserve"> staff accounting membuat/mengubah invoice &amp; bill serta mengaitkannya ke proyek (tidak bisa menghapus dokumen keuangan); </w:t>
+      </w:r>
+      <w:r>
+        <w:rPr>
+          <w:b/>
+        </w:rPr>
+        <w:t>Accounting Manager</w:t>
+      </w:r>
+      <w:r>
+        <w:t xml:space="preserve"> yang memegang hak hapus dokumen keuangan dan memantau proyek berstatus Waspada/Over budget untuk eskalasi ke Operation Manager.</w:t>
       </w:r>
     </w:p>
     <w:p>
@@ -9191,7 +9547,7 @@
         <w:t>wajib</w:t>
       </w:r>
       <w:r>
-        <w:t xml:space="preserve"> setelah perubahan RBAC: menyetel ulang baseline Admin/HRD/OM/Accounting/Kasir/Staff dan </w:t>
+        <w:t xml:space="preserve"> setelah perubahan RBAC: menyetel ulang baseline Admin/HRD/OM/Accounting/Accounting Manager/Kasir/Staff/Team Leader dan </w:t>
       </w:r>
       <w:r>
         <w:rPr>

</xml_diff>

<commit_message>
fix(projects): daftar proyek/task penuh untuk Accounting Manager tanpa tergantung Resource Permission
- OperationalScope: hasFinanceRole() mengenali Accounting + Accounting
  Manager (dipakai projectListScopeIds & isStaffOnly)
- ProjectResource/TaskResource: lepas OwnershipScope untuk role
  full-list (Admin/HRD/finance) — Resource Permission Group tanpa tim
  sebelumnya menyembunyikan semua proyek buatan orang lain
  (kasus Accounting Manager melihat 'No projects')
- Test FinanceProjectListAccessTest (4) + docs (WI, matriks RBAC v1.6, PRD)

Co-authored-by: Cursor <cursoragent@cursor.com>
</commit_message>
<xml_diff>
--- a/WORKING_INSTRUCTION.docx
+++ b/WORKING_INSTRUCTION.docx
@@ -8326,6 +8326,93 @@
       </w:r>
       <w:r>
         <w:t xml:space="preserve"> hanya proyek timnya (scope yang sama dengan Hari Saya); saat staff belum tergabung tim mana pun, halaman mengikuti fallback Hari Saya (seluruh perusahaan).</w:t>
+      </w:r>
+    </w:p>
+    <w:p>
+      <w:pPr>
+        <w:pStyle w:val="ListBullet"/>
+        <w:ind w:left="360"/>
+      </w:pPr>
+      <w:r>
+        <w:rPr>
+          <w:b/>
+        </w:rPr>
+        <w:t>Daftar Projects/Tasks untuk role finance selalu penuh:</w:t>
+      </w:r>
+      <w:r>
+        <w:t xml:space="preserve"> Accounting &amp; Accounting Manager melihat seluruh daftar proyek/task terlepas dari Resource Permission (</w:t>
+      </w:r>
+      <w:r>
+        <w:rPr>
+          <w:rFonts w:ascii="Consolas" w:hAnsi="Consolas"/>
+        </w:rPr>
+        <w:t>OperationalScope</w:t>
+      </w:r>
+      <w:r>
+        <w:t xml:space="preserve"> mengenali kedua role; global scope kepemilikan/</w:t>
+      </w:r>
+      <w:r>
+        <w:rPr>
+          <w:rFonts w:ascii="Consolas" w:hAnsi="Consolas"/>
+        </w:rPr>
+        <w:t>OwnershipScope</w:t>
+      </w:r>
+      <w:r>
+        <w:t xml:space="preserve"> dilonggarkan khusus untuk role full-list Admin/HRD/finance di kedua resource). Jadi Accounting Manager </w:t>
+      </w:r>
+      <w:r>
+        <w:rPr>
+          <w:b/>
+        </w:rPr>
+        <w:t>tidak wajib</w:t>
+      </w:r>
+      <w:r>
+        <w:t xml:space="preserve"> ber-Resource Permission </w:t>
+      </w:r>
+      <w:r>
+        <w:rPr>
+          <w:rFonts w:ascii="Consolas" w:hAnsi="Consolas"/>
+        </w:rPr>
+        <w:t>Global</w:t>
+      </w:r>
+      <w:r>
+        <w:t xml:space="preserve"> dan </w:t>
+      </w:r>
+      <w:r>
+        <w:rPr>
+          <w:b/>
+        </w:rPr>
+        <w:t>tidak wajib</w:t>
+      </w:r>
+      <w:r>
+        <w:t xml:space="preserve"> punya record karyawan tertaut hanya untuk mengontrol anggaran. Troubleshooting bila daftar tetap kosong/menu belum muncul: </w:t>
+      </w:r>
+      <w:r>
+        <w:rPr>
+          <w:b/>
+        </w:rPr>
+        <w:t>logout/login ulang</w:t>
+      </w:r>
+      <w:r>
+        <w:t xml:space="preserve"> setelah perubahan role (cache permission sesi), dan ingat tab default daftar Projects adalah </w:t>
+      </w:r>
+      <w:r>
+        <w:rPr>
+          <w:b/>
+        </w:rPr>
+        <w:t>My Projects</w:t>
+      </w:r>
+      <w:r>
+        <w:t xml:space="preserve"> (hanya proyek yang dipimpin user) — buka tab </w:t>
+      </w:r>
+      <w:r>
+        <w:rPr>
+          <w:b/>
+        </w:rPr>
+        <w:t>Customer Projects</w:t>
+      </w:r>
+      <w:r>
+        <w:t xml:space="preserve"> untuk melihat semuanya.</w:t>
       </w:r>
     </w:p>
     <w:p>

</xml_diff>

<commit_message>
feat(projects): atur anggaran operasional dari halaman Kontrol Anggaran Proyek
- Admin & Accounting Manager dapat mengisi/mengubah operational_cost
  per proyek langsung dari tabel Project Budget Control (tombol
  Atur Anggaran/Ubah + simpan inline, validasi >= 0, notifikasi)
- Accounting staff tetap read-only; role finance tetap tanpa
  update_project_project (field proyek lain wewenang Admin/OM)
- Test ProjectBudgetEditTest (manager bisa + validasi negatif,
  staff ditolak) + docs (WI, matriks RBAC, PRD)

Co-authored-by: Cursor <cursoragent@cursor.com>
</commit_message>
<xml_diff>
--- a/WORKING_INSTRUCTION.docx
+++ b/WORKING_INSTRUCTION.docx
@@ -8437,6 +8437,84 @@
       </w:r>
       <w:r>
         <w:t xml:space="preserve"> yang memegang hak hapus dokumen keuangan dan memantau proyek berstatus Waspada/Over budget untuk eskalasi ke Operation Manager.</w:t>
+      </w:r>
+    </w:p>
+    <w:p>
+      <w:pPr>
+        <w:pStyle w:val="ListBullet"/>
+        <w:ind w:left="360"/>
+      </w:pPr>
+      <w:r>
+        <w:rPr>
+          <w:b/>
+        </w:rPr>
+        <w:t>Mengatur anggaran operasional:</w:t>
+      </w:r>
+      <w:r>
+        <w:t xml:space="preserve"> halaman ini pada dasarnya read-only, tetapi </w:t>
+      </w:r>
+      <w:r>
+        <w:rPr>
+          <w:b/>
+        </w:rPr>
+        <w:t>Admin &amp; Accounting Manager</w:t>
+      </w:r>
+      <w:r>
+        <w:t xml:space="preserve"> dapat mengisi/mengubah </w:t>
+      </w:r>
+      <w:r>
+        <w:rPr>
+          <w:b/>
+        </w:rPr>
+        <w:t>Anggaran Operasional</w:t>
+      </w:r>
+      <w:r>
+        <w:t xml:space="preserve"> tiap proyek langsung dari tabelnya (tombol </w:t>
+      </w:r>
+      <w:r>
+        <w:rPr>
+          <w:b/>
+        </w:rPr>
+        <w:t>Atur Anggaran/Ubah</w:t>
+      </w:r>
+      <w:r>
+        <w:t xml:space="preserve"> di kolom Anggaran Operasional → isi nominal → </w:t>
+      </w:r>
+      <w:r>
+        <w:rPr>
+          <w:b/>
+        </w:rPr>
+        <w:t>Simpan</w:t>
+      </w:r>
+      <w:r>
+        <w:t xml:space="preserve">). Yang diubah hanya angka </w:t>
+      </w:r>
+      <w:r>
+        <w:rPr>
+          <w:rFonts w:ascii="Consolas" w:hAnsi="Consolas"/>
+        </w:rPr>
+        <w:t>operational_cost</w:t>
+      </w:r>
+      <w:r>
+        <w:t xml:space="preserve"> — nilai kontrak, tanggal, Project Manager, dan field proyek lain tetap wewenang Admin/OM lewat Edit Project, dan Accounting staff tidak mendapat tombol ini (anggaran adalah keputusan manajerial). Karena itu role Accounting/Accounting Manager sengaja </w:t>
+      </w:r>
+      <w:r>
+        <w:rPr>
+          <w:b/>
+        </w:rPr>
+        <w:t>tidak</w:t>
+      </w:r>
+      <w:r>
+        <w:t xml:space="preserve"> diberi </w:t>
+      </w:r>
+      <w:r>
+        <w:rPr>
+          <w:rFonts w:ascii="Consolas" w:hAnsi="Consolas"/>
+        </w:rPr>
+        <w:t>update_project_project</w:t>
+      </w:r>
+      <w:r>
+        <w:t>.</w:t>
       </w:r>
     </w:p>
     <w:p>

</xml_diff>

<commit_message>
feat(projects): kolom Sisa Anggaran gantikan Timesheet Hours di Kontrol Anggaran
- Absorption tetap terhitung otomatis (tidak diedit manual); input
  yang diedit hanya anggaran operasional & pengaitan bill ke proyek
- Hapus kolom Timesheet Hours (metrik operasional, bukan keuangan)
  beserta agregasi analytic_records dari ProjectBudgetControlData
- Tambah kolom Sisa Anggaran (anggaran - biaya vendor, merah bila
  negatif) di tabel, ringkasan total, dan ekspor Excel
  (remaining_budget menggantikan timesheet_hours)
- Docs: WI & PRD PRJ-14

Co-authored-by: Cursor <cursoragent@cursor.com>
</commit_message>
<xml_diff>
--- a/WORKING_INSTRUCTION.docx
+++ b/WORKING_INSTRUCTION.docx
@@ -8193,19 +8193,19 @@
         <w:rPr>
           <w:b/>
         </w:rPr>
+        <w:t>Sisa Anggaran</w:t>
+      </w:r>
+      <w:r>
+        <w:t xml:space="preserve"> = anggaran − biaya vendor (merah bila negatif), dan </w:t>
+      </w:r>
+      <w:r>
+        <w:rPr>
+          <w:b/>
+        </w:rPr>
         <w:t>Serapan</w:t>
       </w:r>
       <w:r>
-        <w:t xml:space="preserve"> = biaya vendor ÷ anggaran, dan </w:t>
-      </w:r>
-      <w:r>
-        <w:rPr>
-          <w:b/>
-        </w:rPr>
-        <w:t>Jam Timesheet</w:t>
-      </w:r>
-      <w:r>
-        <w:t xml:space="preserve">. Status otomatis: </w:t>
+        <w:t xml:space="preserve"> = biaya vendor ÷ anggaran (selalu dihitung sistem, tidak dapat diedit manual — yang diedit hanya inputnya: anggaran &amp; pengaitan bill). Kolom jam timesheet sengaja tidak ditampilkan di halaman keuangan ini (metrik operasional itu tempatnya di Project Dashboard/Laporan Ops). Status otomatis: </w:t>
       </w:r>
       <w:r>
         <w:rPr>

</xml_diff>

<commit_message>
fix(security): hapus tim beranggotakan lewat konfirmasi, bukan disembunyikan
- TeamsTable DeleteAction: tombol tidak lagi hidden saat tim masih
  punya anggota (dulu hilang total bahkan untuk Admin dan terasa
  seperti bug). Sekarang selalu tampil bagi yang berhak
  (TeamPolicy delete_security_team), wajib konfirmasi dengan modal
  yang menyebutkan jumlah anggota; anggota dilepas (detach) lalu
  tim dihapus dalam satu alur + notifikasi sukses
- Lang modal hapus tim EN/ID
- Test TeamDeleteActionTest: delete tim beranggotakan berhasil &
  pivot bersih; user tanpa permission delete tidak melihat aksi
- Docs: WI cara menghapus tim (termasuk tim janggal bernama orang)

Co-authored-by: Cursor <cursoragent@cursor.com>
</commit_message>
<xml_diff>
--- a/WORKING_INSTRUCTION.docx
+++ b/WORKING_INSTRUCTION.docx
@@ -1353,6 +1353,47 @@
       </w:r>
       <w:r>
         <w:t xml:space="preserve"> menuju detail masing-masing proyek.</w:t>
+      </w:r>
+    </w:p>
+    <w:p>
+      <w:pPr>
+        <w:pStyle w:val="ListNumber"/>
+      </w:pPr>
+      <w:r>
+        <w:rPr>
+          <w:b/>
+        </w:rPr>
+        <w:t>Menghapus tim:</w:t>
+      </w:r>
+      <w:r>
+        <w:t xml:space="preserve"> Team Board tidak punya aksi hapus (hanya *Details* ke Settings → Teams). Di </w:t>
+      </w:r>
+      <w:r>
+        <w:rPr>
+          <w:b/>
+        </w:rPr>
+        <w:t>Settings → Teams</w:t>
+      </w:r>
+      <w:r>
+        <w:t xml:space="preserve">, tombol </w:t>
+      </w:r>
+      <w:r>
+        <w:rPr>
+          <w:b/>
+        </w:rPr>
+        <w:t>Delete</w:t>
+      </w:r>
+      <w:r>
+        <w:t xml:space="preserve"> selalu tampil bagi yang berhak (</w:t>
+      </w:r>
+      <w:r>
+        <w:rPr>
+          <w:rFonts w:ascii="Consolas" w:hAnsi="Consolas"/>
+        </w:rPr>
+        <w:t>delete_security_team</w:t>
+      </w:r>
+      <w:r>
+        <w:t>, praktisnya Admin); bila tim masih punya anggota, modal konfirmasi menyebutkan jumlah anggotanya — anggota dilepas dari tim dulu, lalu tim dihapus, dalam satu alur. Tim janggal (mis. bernama orang dan tidak tertaut proyek — tim resmi sistem selalu bernama sama dengan proyeknya) bersihkan dengan cara ini; tidak perlu mengosongkan anggota manual lebih dulu.</w:t>
       </w:r>
     </w:p>
     <w:p>

</xml_diff>

<commit_message>
Team Board: layout switcher (Cards/Compact/List) + live search
- View-mode switcher in the Team Board header: Cards (default), Compact
  (denser cards, no About block), and List (one row per team: members,
  projects, tasks, value gated by canViewProjectValue, status bar,
  updated, Details). Choice persisted per session; Project kanban
  unchanged and still Admin/OM only.
- Live search filters cards by team name or project name.
- Compact styling added to modern-theme.css; list reuses existing
  avatar/progress styles.
- Subtitle no longer mentions project value (hidden for non-finance).
- Tests: TeamBoardLayoutTest (3) covering search filtering, render in
  all three modes, mode validation/persistence.
- Docs: WORKING_INSTRUCTION section 1.C point 5 (md + docx).

Co-authored-by: Cursor <cursoragent@cursor.com>
</commit_message>
<xml_diff>
--- a/WORKING_INSTRUCTION.docx
+++ b/WORKING_INSTRUCTION.docx
@@ -1353,6 +1353,81 @@
       </w:r>
       <w:r>
         <w:t xml:space="preserve"> menuju detail masing-masing proyek.</w:t>
+      </w:r>
+    </w:p>
+    <w:p>
+      <w:pPr>
+        <w:pStyle w:val="ListBullet"/>
+        <w:ind w:left="360"/>
+      </w:pPr>
+      <w:r>
+        <w:rPr>
+          <w:b/>
+        </w:rPr>
+        <w:t>Pilihan tampilan (layout)</w:t>
+      </w:r>
+      <w:r>
+        <w:t xml:space="preserve"> di header papan: </w:t>
+      </w:r>
+      <w:r>
+        <w:rPr>
+          <w:b/>
+        </w:rPr>
+        <w:t>Cards</w:t>
+      </w:r>
+      <w:r>
+        <w:t xml:space="preserve"> (default, kartu penuh), </w:t>
+      </w:r>
+      <w:r>
+        <w:rPr>
+          <w:b/>
+        </w:rPr>
+        <w:t>Compact</w:t>
+      </w:r>
+      <w:r>
+        <w:t xml:space="preserve"> (kartu ringkas — muat lebih banyak tim per layar, tanpa blok *About team*), dan </w:t>
+      </w:r>
+      <w:r>
+        <w:rPr>
+          <w:b/>
+        </w:rPr>
+        <w:t>List</w:t>
+      </w:r>
+      <w:r>
+        <w:t xml:space="preserve"> (satu baris per tim dalam tabel: Tim, Anggota, Proyek, Task, Nilai (hanya untuk yang berhak melihat nilai kontrak), Status, Diperbarui, Details). Pilihan tersimpan otomatis per sesi login. </w:t>
+      </w:r>
+      <w:r>
+        <w:rPr>
+          <w:b/>
+        </w:rPr>
+        <w:t>Project kanban</w:t>
+      </w:r>
+      <w:r>
+        <w:t xml:space="preserve"> (Admin/OM) tetap tersedia dan tidak berubah.</w:t>
+      </w:r>
+    </w:p>
+    <w:p>
+      <w:pPr>
+        <w:pStyle w:val="ListBullet"/>
+        <w:ind w:left="360"/>
+      </w:pPr>
+      <w:r>
+        <w:rPr>
+          <w:b/>
+        </w:rPr>
+        <w:t>Pencarian</w:t>
+      </w:r>
+      <w:r>
+        <w:t xml:space="preserve"> di header memfilter kartu menurut </w:t>
+      </w:r>
+      <w:r>
+        <w:rPr>
+          <w:b/>
+        </w:rPr>
+        <w:t>nama tim atau nama proyek</w:t>
+      </w:r>
+      <w:r>
+        <w:t xml:space="preserve"> (ketik langsung, hasil terfilter live) — berguna saat jumlah tim/proyek sudah banyak.</w:t>
       </w:r>
     </w:p>
     <w:p>

</xml_diff>

<commit_message>
Team Board: add sort dropdown (name, members, projects, tasks, progress, value, updated)
- Native select in the board header next to search; applies to Cards,
  Compact, and List modes and combines with the live search.
- Options: Name A-Z/Z-A (default A-Z), Most members, Most projects,
  Most tasks, Highest/Lowest progress, Highest value, Recently updated.
  Highest value only offered when the viewer may see contract values
  (OperationalScope::canViewProjectValue); hidden-value cards sink to
  the bottom on that sort.
- Choice validated server-side and persisted per session like the
  view mode; kanban unchanged.
- Cards now carry raw value_amount/updated_ts for reliable sorting.
- Tests: TeamBoardLayoutTest sorting case (name asc/desc, members
  desc, persistence, bogus fallback). WI 1.C updated (md + docx).

Co-authored-by: Cursor <cursoragent@cursor.com>
</commit_message>
<xml_diff>
--- a/WORKING_INSTRUCTION.docx
+++ b/WORKING_INSTRUCTION.docx
@@ -1428,6 +1428,84 @@
       </w:r>
       <w:r>
         <w:t xml:space="preserve"> (ketik langsung, hasil terfilter live) — berguna saat jumlah tim/proyek sudah banyak.</w:t>
+      </w:r>
+    </w:p>
+    <w:p>
+      <w:pPr>
+        <w:pStyle w:val="ListBullet"/>
+        <w:ind w:left="360"/>
+      </w:pPr>
+      <w:r>
+        <w:rPr>
+          <w:b/>
+        </w:rPr>
+        <w:t>Sortir (Urutkan)</w:t>
+      </w:r>
+      <w:r>
+        <w:t xml:space="preserve"> di header mengurutkan kartu/baris di semua mode tampilan: </w:t>
+      </w:r>
+      <w:r>
+        <w:rPr>
+          <w:b/>
+        </w:rPr>
+        <w:t>Nama A–Z / Z–A</w:t>
+      </w:r>
+      <w:r>
+        <w:t xml:space="preserve"> (default A–Z), </w:t>
+      </w:r>
+      <w:r>
+        <w:rPr>
+          <w:b/>
+        </w:rPr>
+        <w:t>Anggota terbanyak</w:t>
+      </w:r>
+      <w:r>
+        <w:t xml:space="preserve">, </w:t>
+      </w:r>
+      <w:r>
+        <w:rPr>
+          <w:b/>
+        </w:rPr>
+        <w:t>Proyek terbanyak</w:t>
+      </w:r>
+      <w:r>
+        <w:t xml:space="preserve">, </w:t>
+      </w:r>
+      <w:r>
+        <w:rPr>
+          <w:b/>
+        </w:rPr>
+        <w:t>Task terbanyak</w:t>
+      </w:r>
+      <w:r>
+        <w:t xml:space="preserve">, </w:t>
+      </w:r>
+      <w:r>
+        <w:rPr>
+          <w:b/>
+        </w:rPr>
+        <w:t>Progress tertinggi / terendah</w:t>
+      </w:r>
+      <w:r>
+        <w:t xml:space="preserve">, </w:t>
+      </w:r>
+      <w:r>
+        <w:rPr>
+          <w:b/>
+        </w:rPr>
+        <w:t>Terakhir diperbarui</w:t>
+      </w:r>
+      <w:r>
+        <w:t xml:space="preserve">, dan </w:t>
+      </w:r>
+      <w:r>
+        <w:rPr>
+          <w:b/>
+        </w:rPr>
+        <w:t>Nilai terbesar</w:t>
+      </w:r>
+      <w:r>
+        <w:t xml:space="preserve"> (opsi nilai hanya muncul bagi yang berhak melihat nilai kontrak). Pilihan sortir juga tersimpan per sesi, dan berlaku bersamaan dengan pencarian.</w:t>
       </w:r>
     </w:p>
     <w:p>

</xml_diff>

<commit_message>
Docs: PRD v1.4 (SEC-09 team delete, PRJ-17 Team Board layouts/search/sort) + WI cross-ref
- PRD header bumped to v1.4 / 2026-10-21 with revision summary.
- SEC-09: authorized users can delete a team that still has members
  via a confirmation modal naming the member count (detach then
  delete); Team Board has no delete action; OM remains delete-less.
- PRJ-17: Team Board Cards/Compact/List layouts, live search by team
  or project name, server-validated session-persisted sorting (value
  sort bound by the PRJ-16 contract-value gate), kanban unchanged.
- WORKING_INSTRUCTION feature bullet now references the Team Board
  layouts/search/sort and points to section 1.C point 5; docx
  regenerated. RBAC matrix unchanged (no permission changes).

Co-authored-by: Cursor <cursoragent@cursor.com>
</commit_message>
<xml_diff>
--- a/WORKING_INSTRUCTION.docx
+++ b/WORKING_INSTRUCTION.docx
@@ -8082,7 +8082,43 @@
         <w:t>Team Board</w:t>
       </w:r>
       <w:r>
-        <w:t xml:space="preserve">: mode </w:t>
+        <w:t xml:space="preserve"> (</w:t>
+      </w:r>
+      <w:r>
+        <w:rPr>
+          <w:rFonts w:ascii="Consolas" w:hAnsi="Consolas"/>
+        </w:rPr>
+        <w:t>/admin/team-board</w:t>
+      </w:r>
+      <w:r>
+        <w:t xml:space="preserve">): pilihan tampilan </w:t>
+      </w:r>
+      <w:r>
+        <w:rPr>
+          <w:b/>
+        </w:rPr>
+        <w:t>Kartu Tim / Ringkas / Daftar</w:t>
+      </w:r>
+      <w:r>
+        <w:t xml:space="preserve"> + </w:t>
+      </w:r>
+      <w:r>
+        <w:rPr>
+          <w:b/>
+        </w:rPr>
+        <w:t>pencarian</w:t>
+      </w:r>
+      <w:r>
+        <w:t xml:space="preserve"> nama tim/proyek + </w:t>
+      </w:r>
+      <w:r>
+        <w:rPr>
+          <w:b/>
+        </w:rPr>
+        <w:t>sortir</w:t>
+      </w:r>
+      <w:r>
+        <w:t xml:space="preserve"> (nama, anggota, proyek, task, progress, nilai, terakhir diperbarui) yang tersimpan per sesi, plus mode </w:t>
       </w:r>
       <w:r>
         <w:rPr>
@@ -8091,7 +8127,7 @@
         <w:t>Kanban Proyek</w:t>
       </w:r>
       <w:r>
-        <w:t xml:space="preserve"> (seret karyawan antar proyek) untuk Admin/OM.</w:t>
+        <w:t xml:space="preserve"> (seret karyawan antar proyek) untuk Admin/OM — rinciannya di Bagian 1.C poin 5.</w:t>
       </w:r>
     </w:p>
     <w:p>

</xml_diff>

<commit_message>
Docs: record OTP/MFA login status and plan (PRD SEC-10, WI 1.F)
- PRD: SEC-10 planned requirement to activate Filament built-in MFA
  (email OTP and/or TOTP + recovery codes) with staged mandatory
  rollout; documents that the foundation is already installed (User
  MFA contracts, migrated columns, login/profile challenge plumbing)
  and why Cloudflare Access One-time PIN is not the primary choice
  (50-user free tier, double login without JWT integration, origin
  lock-down) while Turnstile is bot protection only. Roadmap item and
  decision-log row added.
- WORKING_INSTRUCTION 1.F: login section now states OTP is not yet
  active, what activation entails, and the SMTP/email prerequisite.
- No code changes; login remains password + rate limit/IP blocking.

Co-authored-by: Cursor <cursoragent@cursor.com>
</commit_message>
<xml_diff>
--- a/WORKING_INSTRUCTION.docx
+++ b/WORKING_INSTRUCTION.docx
@@ -2341,6 +2341,125 @@
       </w:r>
       <w:r>
         <w:t>.</w:t>
+      </w:r>
+    </w:p>
+    <w:p>
+      <w:pPr>
+        <w:pStyle w:val="ListNumber"/>
+      </w:pPr>
+      <w:r>
+        <w:rPr>
+          <w:b/>
+        </w:rPr>
+        <w:t>OTP / MFA saat login (status: belum aktif — rencana disetujui, implementasi ditahan):</w:t>
+      </w:r>
+    </w:p>
+    <w:p>
+      <w:pPr>
+        <w:pStyle w:val="ListBullet"/>
+        <w:ind w:left="360"/>
+      </w:pPr>
+      <w:r>
+        <w:t xml:space="preserve">Fondasi sudah terpasang lengkap di kode: model User mengimplementasikan </w:t>
+      </w:r>
+      <w:r>
+        <w:rPr>
+          <w:b/>
+        </w:rPr>
+        <w:t>Email Authentication (OTP via email)</w:t>
+      </w:r>
+      <w:r>
+        <w:t xml:space="preserve"> dan </w:t>
+      </w:r>
+      <w:r>
+        <w:rPr>
+          <w:b/>
+        </w:rPr>
+        <w:t>App Authentication (TOTP/authenticator + recovery codes)</w:t>
+      </w:r>
+      <w:r>
+        <w:t xml:space="preserve"> bawaan Filament, kolom database-nya sudah ada, dan halaman Login + Profile sudah menangani alur challenge-nya. Aktivasi tinggal mendaftarkan provider MFA di </w:t>
+      </w:r>
+      <w:r>
+        <w:rPr>
+          <w:rFonts w:ascii="Consolas" w:hAnsi="Consolas"/>
+        </w:rPr>
+        <w:t>AdminPanelProvider</w:t>
+      </w:r>
+      <w:r>
+        <w:t xml:space="preserve"> — belum dilakukan, jadi </w:t>
+      </w:r>
+      <w:r>
+        <w:rPr>
+          <w:b/>
+        </w:rPr>
+        <w:t>saat ini login tetap username/password</w:t>
+      </w:r>
+      <w:r>
+        <w:t xml:space="preserve"> yang dilindungi poin 1–4 di atas.</w:t>
+      </w:r>
+    </w:p>
+    <w:p>
+      <w:pPr>
+        <w:pStyle w:val="ListBullet"/>
+        <w:ind w:left="360"/>
+      </w:pPr>
+      <w:r>
+        <w:t xml:space="preserve">Rencana aktivasi (PRD </w:t>
+      </w:r>
+      <w:r>
+        <w:rPr>
+          <w:rFonts w:ascii="Consolas" w:hAnsi="Consolas"/>
+        </w:rPr>
+        <w:t>SEC-10</w:t>
+      </w:r>
+      <w:r>
+        <w:t xml:space="preserve">): wajib bertahap — </w:t>
+      </w:r>
+      <w:r>
+        <w:rPr>
+          <w:b/>
+        </w:rPr>
+        <w:t>Admin &amp; Accounting Manager dulu</w:t>
+      </w:r>
+      <w:r>
+        <w:t xml:space="preserve">, lalu Operation Manager, lalu semua user; user mengatur OTP dari halaman </w:t>
+      </w:r>
+      <w:r>
+        <w:rPr>
+          <w:b/>
+        </w:rPr>
+        <w:t>Profile</w:t>
+      </w:r>
+      <w:r>
+        <w:t>.</w:t>
+      </w:r>
+    </w:p>
+    <w:p>
+      <w:pPr>
+        <w:pStyle w:val="ListBullet"/>
+        <w:ind w:left="360"/>
+      </w:pPr>
+      <w:r>
+        <w:t xml:space="preserve">Prasyarat sebelum aktivasi: pastikan </w:t>
+      </w:r>
+      <w:r>
+        <w:rPr>
+          <w:b/>
+        </w:rPr>
+        <w:t>SMTP produksi andal</w:t>
+      </w:r>
+      <w:r>
+        <w:t xml:space="preserve"> dan alamat email user aktif (kode OTP email kadaluarsa singkat). Alternatif yang sudah dievaluasi dan </w:t>
+      </w:r>
+      <w:r>
+        <w:rPr>
+          <w:b/>
+        </w:rPr>
+        <w:t>tidak</w:t>
+      </w:r>
+      <w:r>
+        <w:t xml:space="preserve"> dijadikan pilihan utama: *Cloudflare Access One-time PIN* (gerbang luar; gratis hanya ≤50 user, login ganda tanpa integrasi JWT, origin wajib dikunci) dan *Cloudflare Turnstile* (anti-bot saja, bukan OTP — boleh ditambahkan sebagai pelengkap kapan pun). Cloudflare tidak menyediakan OTP SMS/WhatsApp.</w:t>
       </w:r>
     </w:p>
     <w:p>

</xml_diff>